<commit_message>
updated the sound credits word doc
Shows the ones in use ***
</commit_message>
<xml_diff>
--- a/2025AU-Afternoon-Engines-2/Assets/Assets/sound credits.docx
+++ b/2025AU-Afternoon-Engines-2/Assets/Assets/sound credits.docx
@@ -3,16 +3,22 @@
 <w:document xmlns:wpc="http://schemas.microsoft.com/office/word/2010/wordprocessingCanvas" xmlns:cx="http://schemas.microsoft.com/office/drawing/2014/chartex" xmlns:cx1="http://schemas.microsoft.com/office/drawing/2015/9/8/chartex" xmlns:cx2="http://schemas.microsoft.com/office/drawing/2015/10/21/chartex" xmlns:cx3="http://schemas.microsoft.com/office/drawing/2016/5/9/chartex" xmlns:cx4="http://schemas.microsoft.com/office/drawing/2016/5/10/chartex" xmlns:cx5="http://schemas.microsoft.com/office/drawing/2016/5/11/chartex" xmlns:cx6="http://schemas.microsoft.com/office/drawing/2016/5/12/chartex" xmlns:cx7="http://schemas.microsoft.com/office/drawing/2016/5/13/chartex" xmlns:cx8="http://schemas.microsoft.com/office/drawing/2016/5/14/chartex" xmlns:mc="http://schemas.openxmlformats.org/markup-compatibility/2006" xmlns:aink="http://schemas.microsoft.com/office/drawing/2016/ink" xmlns:am3d="http://schemas.microsoft.com/office/drawing/2017/model3d" xmlns:o="urn:schemas-microsoft-com:office:office" xmlns:oel="http://schemas.microsoft.com/office/2019/extlst" xmlns:r="http://schemas.openxmlformats.org/officeDocument/2006/relationships" xmlns:m="http://schemas.openxmlformats.org/officeDocument/2006/math" xmlns:v="urn:schemas-microsoft-com:vml" xmlns:wp14="http://schemas.microsoft.com/office/word/2010/wordprocessingDrawing" xmlns:wp="http://schemas.openxmlformats.org/drawingml/2006/wordprocessingDrawing" xmlns:w10="urn:schemas-microsoft-com:office:word" xmlns:w="http://schemas.openxmlformats.org/wordprocessingml/2006/main" xmlns:w14="http://schemas.microsoft.com/office/word/2010/wordml" xmlns:w15="http://schemas.microsoft.com/office/word/2012/wordml" xmlns:w16cex="http://schemas.microsoft.com/office/word/2018/wordml/cex" xmlns:w16cid="http://schemas.microsoft.com/office/word/2016/wordml/cid" xmlns:w16="http://schemas.microsoft.com/office/word/2018/wordml" xmlns:w16du="http://schemas.microsoft.com/office/word/2023/wordml/word16du" xmlns:w16sdtdh="http://schemas.microsoft.com/office/word/2020/wordml/sdtdatahash" xmlns:w16sdtfl="http://schemas.microsoft.com/office/word/2024/wordml/sdtformatlock" xmlns:w16se="http://schemas.microsoft.com/office/word/2015/wordml/symex" xmlns:wpg="http://schemas.microsoft.com/office/word/2010/wordprocessingGroup" xmlns:wpi="http://schemas.microsoft.com/office/word/2010/wordprocessingInk" xmlns:wne="http://schemas.microsoft.com/office/word/2006/wordml" xmlns:wps="http://schemas.microsoft.com/office/word/2010/wordprocessingShape" mc:Ignorable="w14 w15 w16se w16cid w16 w16cex w16sdtdh w16sdtfl w16du wp14">
   <w:body>
     <w:p>
-      <w:r>
-        <w:t xml:space="preserve">these were found after Sunday meeting so need in put </w:t>
-      </w:r>
-      <w:proofErr w:type="gramStart"/>
-      <w:r>
-        <w:t>on them</w:t>
-      </w:r>
-      <w:proofErr w:type="gramEnd"/>
-    </w:p>
-    <w:p>
+      <w:proofErr w:type="spellStart"/>
+      <w:r>
+        <w:t>Shoues</w:t>
+      </w:r>
+      <w:proofErr w:type="spellEnd"/>
+      <w:r>
+        <w:t xml:space="preserve"> the ones in use ***</w:t>
+      </w:r>
+    </w:p>
+    <w:p>
+      <w:r>
+        <w:br/>
+      </w:r>
+      <w:r>
+        <w:br/>
+      </w:r>
       <w:r>
         <w:t>ominous Music 1</w:t>
       </w:r>
@@ -27,9 +33,6 @@
           <w:t>https://freesound.org/people/Akkaittou/sounds/829894</w:t>
         </w:r>
       </w:hyperlink>
-      <w:r>
-        <w:t xml:space="preserve"> </w:t>
-      </w:r>
     </w:p>
     <w:p>
       <w:r>
@@ -46,6 +49,12 @@
           <w:t>https://freesound.org/people/Attia.phonatics/sounds/829465</w:t>
         </w:r>
       </w:hyperlink>
+      <w:r>
+        <w:tab/>
+      </w:r>
+      <w:r>
+        <w:t>***</w:t>
+      </w:r>
     </w:p>
     <w:p>
       <w:r>
@@ -86,421 +95,469 @@
       </w:r>
     </w:p>
     <w:p/>
+    <w:p>
+      <w:r>
+        <w:t>ominous ambience 1</w:t>
+      </w:r>
+      <w:r>
+        <w:t xml:space="preserve"> </w:t>
+      </w:r>
+      <w:hyperlink r:id="rId8" w:history="1">
+        <w:r>
+          <w:rPr>
+            <w:rStyle w:val="Hyperlink"/>
+          </w:rPr>
+          <w:t>https://freesound.org/people/ChristmasKrumble666/sounds/826072</w:t>
+        </w:r>
+      </w:hyperlink>
+      <w:r>
+        <w:t xml:space="preserve"> </w:t>
+      </w:r>
+    </w:p>
+    <w:p>
+      <w:r>
+        <w:t xml:space="preserve">ominous ambience </w:t>
+      </w:r>
+      <w:r>
+        <w:t xml:space="preserve">2 </w:t>
+      </w:r>
+      <w:hyperlink r:id="rId9" w:history="1">
+        <w:r>
+          <w:rPr>
+            <w:rStyle w:val="Hyperlink"/>
+          </w:rPr>
+          <w:t>https://freesound.org/people/Johnmode/sounds/818855</w:t>
+        </w:r>
+      </w:hyperlink>
+    </w:p>
+    <w:p>
+      <w:r>
+        <w:t>ominous ambience</w:t>
+      </w:r>
+      <w:r>
+        <w:t xml:space="preserve"> 3 </w:t>
+      </w:r>
+      <w:hyperlink r:id="rId10" w:history="1">
+        <w:r>
+          <w:rPr>
+            <w:rStyle w:val="Hyperlink"/>
+          </w:rPr>
+          <w:t>https://freesound.org/people/ChristmasKrumble666/sounds/801947</w:t>
+        </w:r>
+      </w:hyperlink>
+      <w:r>
+        <w:t xml:space="preserve"> </w:t>
+      </w:r>
+    </w:p>
+    <w:p>
+      <w:r>
+        <w:t xml:space="preserve">ominous ambience </w:t>
+      </w:r>
+      <w:r>
+        <w:t xml:space="preserve">4 </w:t>
+      </w:r>
+      <w:hyperlink r:id="rId11" w:history="1">
+        <w:r>
+          <w:rPr>
+            <w:rStyle w:val="Hyperlink"/>
+          </w:rPr>
+          <w:t>https://freesound.org/people/JoBot__/sounds/795756</w:t>
+        </w:r>
+      </w:hyperlink>
+      <w:r>
+        <w:t xml:space="preserve"> </w:t>
+      </w:r>
+    </w:p>
+    <w:p>
+      <w:r>
+        <w:t xml:space="preserve">ominous ambience </w:t>
+      </w:r>
+      <w:r>
+        <w:t xml:space="preserve">5 </w:t>
+      </w:r>
+      <w:hyperlink r:id="rId12" w:history="1">
+        <w:r>
+          <w:rPr>
+            <w:rStyle w:val="Hyperlink"/>
+          </w:rPr>
+          <w:t>https://freesound.org/people/JoBot__/sounds/795757</w:t>
+        </w:r>
+      </w:hyperlink>
+      <w:r>
+        <w:t xml:space="preserve"> </w:t>
+      </w:r>
+    </w:p>
     <w:p/>
     <w:p>
       <w:r>
-        <w:t>ominous ambience 1</w:t>
-      </w:r>
-      <w:r>
-        <w:t xml:space="preserve"> </w:t>
-      </w:r>
-      <w:hyperlink r:id="rId8" w:history="1">
-        <w:r>
-          <w:rPr>
-            <w:rStyle w:val="Hyperlink"/>
-          </w:rPr>
-          <w:t>https://freesound.org/people/ChristmasKrumble666/sounds/826072</w:t>
-        </w:r>
-      </w:hyperlink>
-      <w:r>
-        <w:t xml:space="preserve"> </w:t>
-      </w:r>
-    </w:p>
-    <w:p>
-      <w:r>
-        <w:t xml:space="preserve">ominous ambience </w:t>
+        <w:t>tense 1</w:t>
+      </w:r>
+      <w:r>
+        <w:t xml:space="preserve"> </w:t>
+      </w:r>
+      <w:hyperlink r:id="rId13" w:history="1">
+        <w:r>
+          <w:rPr>
+            <w:rStyle w:val="Hyperlink"/>
+          </w:rPr>
+          <w:t>https://freesound.org/people/ZHRØ/sounds/817498</w:t>
+        </w:r>
+      </w:hyperlink>
+      <w:r>
+        <w:t xml:space="preserve"> </w:t>
+      </w:r>
+    </w:p>
+    <w:p>
+      <w:r>
+        <w:t xml:space="preserve">tense </w:t>
       </w:r>
       <w:r>
         <w:t xml:space="preserve">2 </w:t>
       </w:r>
-      <w:hyperlink r:id="rId9" w:history="1">
-        <w:r>
-          <w:rPr>
-            <w:rStyle w:val="Hyperlink"/>
-          </w:rPr>
-          <w:t>https://freesound.org/people/Johnmode/sounds/818855</w:t>
-        </w:r>
-      </w:hyperlink>
-    </w:p>
-    <w:p>
-      <w:r>
-        <w:t>ominous ambience</w:t>
+      <w:hyperlink r:id="rId14" w:history="1">
+        <w:r>
+          <w:rPr>
+            <w:rStyle w:val="Hyperlink"/>
+          </w:rPr>
+          <w:t>https://freesound.org/people/ceethewhite/sounds/801437</w:t>
+        </w:r>
+      </w:hyperlink>
+      <w:r>
+        <w:t xml:space="preserve"> </w:t>
+      </w:r>
+    </w:p>
+    <w:p/>
+    <w:p>
+      <w:r>
+        <w:t xml:space="preserve">maybe </w:t>
+      </w:r>
+      <w:r>
+        <w:t xml:space="preserve">1 </w:t>
+      </w:r>
+      <w:hyperlink r:id="rId15" w:history="1">
+        <w:r>
+          <w:rPr>
+            <w:rStyle w:val="Hyperlink"/>
+          </w:rPr>
+          <w:t>https://freesound.org/people/Destructo20/sounds/824702</w:t>
+        </w:r>
+      </w:hyperlink>
+      <w:r>
+        <w:t xml:space="preserve"> </w:t>
+      </w:r>
+    </w:p>
+    <w:p>
+      <w:r>
+        <w:t xml:space="preserve">maybe </w:t>
+      </w:r>
+      <w:r>
+        <w:t>2</w:t>
+      </w:r>
+      <w:r>
+        <w:t xml:space="preserve"> </w:t>
+      </w:r>
+      <w:hyperlink r:id="rId16" w:history="1">
+        <w:r>
+          <w:rPr>
+            <w:rStyle w:val="Hyperlink"/>
+          </w:rPr>
+          <w:t>https://freesound.org/people/SergeQuadrado/sounds/797741</w:t>
+        </w:r>
+      </w:hyperlink>
+      <w:r>
+        <w:t xml:space="preserve"> </w:t>
+      </w:r>
+    </w:p>
+    <w:p>
+      <w:r>
+        <w:t>maybe</w:t>
       </w:r>
       <w:r>
         <w:t xml:space="preserve"> 3 </w:t>
       </w:r>
-      <w:hyperlink r:id="rId10" w:history="1">
-        <w:r>
-          <w:rPr>
-            <w:rStyle w:val="Hyperlink"/>
-          </w:rPr>
-          <w:t>https://freesound.org/people/ChristmasKrumble666/sounds/801947</w:t>
-        </w:r>
-      </w:hyperlink>
-      <w:r>
-        <w:t xml:space="preserve"> </w:t>
-      </w:r>
-    </w:p>
-    <w:p>
-      <w:r>
-        <w:t xml:space="preserve">ominous ambience </w:t>
-      </w:r>
-      <w:r>
-        <w:t xml:space="preserve">4 </w:t>
-      </w:r>
-      <w:hyperlink r:id="rId11" w:history="1">
-        <w:r>
-          <w:rPr>
-            <w:rStyle w:val="Hyperlink"/>
-          </w:rPr>
-          <w:t>https://freesound.org/people/JoBot__/sounds/795756</w:t>
-        </w:r>
-      </w:hyperlink>
-      <w:r>
-        <w:t xml:space="preserve"> </w:t>
-      </w:r>
-    </w:p>
-    <w:p>
-      <w:r>
-        <w:t xml:space="preserve">ominous ambience </w:t>
-      </w:r>
-      <w:r>
-        <w:t xml:space="preserve">5 </w:t>
-      </w:r>
-      <w:hyperlink r:id="rId12" w:history="1">
-        <w:r>
-          <w:rPr>
-            <w:rStyle w:val="Hyperlink"/>
-          </w:rPr>
-          <w:t>https://freesound.org/people/JoBot__/sounds/795757</w:t>
-        </w:r>
-      </w:hyperlink>
-      <w:r>
-        <w:t xml:space="preserve"> </w:t>
+      <w:hyperlink r:id="rId17" w:history="1">
+        <w:r>
+          <w:rPr>
+            <w:rStyle w:val="Hyperlink"/>
+          </w:rPr>
+          <w:t>https://freesound.org/people/ceethewhite/sounds/796080</w:t>
+        </w:r>
+      </w:hyperlink>
+      <w:r>
+        <w:t xml:space="preserve"> </w:t>
+      </w:r>
+      <w:r>
+        <w:tab/>
+      </w:r>
+      <w:r>
+        <w:t>***</w:t>
       </w:r>
     </w:p>
     <w:p/>
+    <w:p>
+      <w:proofErr w:type="spellStart"/>
+      <w:r>
+        <w:t>playerScream</w:t>
+      </w:r>
+      <w:proofErr w:type="spellEnd"/>
+      <w:r>
+        <w:t xml:space="preserve"> </w:t>
+      </w:r>
+      <w:hyperlink r:id="rId18" w:history="1">
+        <w:r>
+          <w:rPr>
+            <w:rStyle w:val="Hyperlink"/>
+          </w:rPr>
+          <w:t>https://freesound.org/people/vtownpunks/sounds/63639</w:t>
+        </w:r>
+      </w:hyperlink>
+      <w:r>
+        <w:t xml:space="preserve"> </w:t>
+      </w:r>
+    </w:p>
+    <w:p>
+      <w:r>
+        <w:t xml:space="preserve">footsteps 1 </w:t>
+      </w:r>
+      <w:hyperlink r:id="rId19" w:history="1">
+        <w:r>
+          <w:rPr>
+            <w:rStyle w:val="Hyperlink"/>
+          </w:rPr>
+          <w:t>https://freesound.org/people/atleastrelatively/sounds/816413</w:t>
+        </w:r>
+      </w:hyperlink>
+    </w:p>
+    <w:p>
+      <w:r>
+        <w:t xml:space="preserve">footsteps 2 </w:t>
+      </w:r>
+      <w:hyperlink r:id="rId20" w:history="1">
+        <w:r>
+          <w:rPr>
+            <w:rStyle w:val="Hyperlink"/>
+          </w:rPr>
+          <w:t>https://freesound.org/people/qubodup/sounds/816019</w:t>
+        </w:r>
+      </w:hyperlink>
+      <w:r>
+        <w:t xml:space="preserve"> </w:t>
+      </w:r>
+    </w:p>
+    <w:p>
+      <w:r>
+        <w:t xml:space="preserve">footsteps 3 </w:t>
+      </w:r>
+      <w:hyperlink r:id="rId21" w:history="1">
+        <w:r>
+          <w:rPr>
+            <w:rStyle w:val="Hyperlink"/>
+          </w:rPr>
+          <w:t>https://freesound.org/people/qubodup/sounds/816018</w:t>
+        </w:r>
+      </w:hyperlink>
+      <w:r>
+        <w:t xml:space="preserve"> </w:t>
+      </w:r>
+    </w:p>
+    <w:p>
+      <w:r>
+        <w:t xml:space="preserve">footsteps 4 </w:t>
+      </w:r>
+      <w:hyperlink r:id="rId22" w:history="1">
+        <w:r>
+          <w:rPr>
+            <w:rStyle w:val="Hyperlink"/>
+          </w:rPr>
+          <w:t>https://freesound.org/people/suchiradhar/sounds/790057</w:t>
+        </w:r>
+      </w:hyperlink>
+      <w:r>
+        <w:t xml:space="preserve"> </w:t>
+      </w:r>
+    </w:p>
+    <w:p>
+      <w:r>
+        <w:t xml:space="preserve">footsteps 5 </w:t>
+      </w:r>
+      <w:hyperlink r:id="rId23" w:history="1">
+        <w:r>
+          <w:rPr>
+            <w:rStyle w:val="Hyperlink"/>
+          </w:rPr>
+          <w:t>https://freesound.org/people/Baderomar96/sounds/788512</w:t>
+        </w:r>
+      </w:hyperlink>
+      <w:r>
+        <w:t xml:space="preserve"> </w:t>
+      </w:r>
+    </w:p>
+    <w:p>
+      <w:r>
+        <w:lastRenderedPageBreak/>
+        <w:t xml:space="preserve"> </w:t>
+      </w:r>
+      <w:r>
+        <w:t>siren</w:t>
+      </w:r>
+      <w:r>
+        <w:t xml:space="preserve"> </w:t>
+      </w:r>
+      <w:hyperlink r:id="rId24" w:history="1">
+        <w:r>
+          <w:rPr>
+            <w:rStyle w:val="Hyperlink"/>
+          </w:rPr>
+          <w:t>https://freesound.org/people/kevp888/sounds/830006</w:t>
+        </w:r>
+      </w:hyperlink>
+      <w:r>
+        <w:t xml:space="preserve"> </w:t>
+      </w:r>
+    </w:p>
     <w:p/>
     <w:p>
       <w:r>
-        <w:t>tense 1</w:t>
-      </w:r>
-      <w:r>
-        <w:t xml:space="preserve"> </w:t>
-      </w:r>
-      <w:hyperlink r:id="rId13" w:history="1">
-        <w:r>
-          <w:rPr>
-            <w:rStyle w:val="Hyperlink"/>
-          </w:rPr>
-          <w:t>https://freesound.org/people/ZHRØ/sounds/817498</w:t>
-        </w:r>
-      </w:hyperlink>
-      <w:r>
-        <w:t xml:space="preserve"> </w:t>
-      </w:r>
-    </w:p>
-    <w:p>
-      <w:r>
-        <w:t xml:space="preserve">tense </w:t>
-      </w:r>
-      <w:r>
-        <w:t xml:space="preserve">2 </w:t>
-      </w:r>
-      <w:hyperlink r:id="rId14" w:history="1">
-        <w:r>
-          <w:rPr>
-            <w:rStyle w:val="Hyperlink"/>
-          </w:rPr>
-          <w:t>https://freesound.org/people/ceethewhite/sounds/801437</w:t>
-        </w:r>
-      </w:hyperlink>
-      <w:r>
-        <w:t xml:space="preserve"> </w:t>
+        <w:t xml:space="preserve">zombie 1 </w:t>
+      </w:r>
+      <w:hyperlink r:id="rId25" w:history="1">
+        <w:r>
+          <w:rPr>
+            <w:rStyle w:val="Hyperlink"/>
+          </w:rPr>
+          <w:t>https://freesound.org/people/iSaria/sounds/326266</w:t>
+        </w:r>
+      </w:hyperlink>
+      <w:r>
+        <w:t xml:space="preserve"> </w:t>
+      </w:r>
+      <w:r>
+        <w:tab/>
+      </w:r>
+      <w:r>
+        <w:t>***</w:t>
+      </w:r>
+    </w:p>
+    <w:p>
+      <w:r>
+        <w:t xml:space="preserve">zombie 2 </w:t>
+      </w:r>
+      <w:hyperlink r:id="rId26" w:history="1">
+        <w:r>
+          <w:rPr>
+            <w:rStyle w:val="Hyperlink"/>
+          </w:rPr>
+          <w:t>https://freesound.org/people/klankbeeld/sounds/126323</w:t>
+        </w:r>
+      </w:hyperlink>
+      <w:r>
+        <w:t xml:space="preserve"> </w:t>
+      </w:r>
+    </w:p>
+    <w:p>
+      <w:r>
+        <w:t xml:space="preserve">zombie 3 </w:t>
+      </w:r>
+      <w:hyperlink r:id="rId27" w:history="1">
+        <w:r>
+          <w:rPr>
+            <w:rStyle w:val="Hyperlink"/>
+          </w:rPr>
+          <w:t>https://freesound.org/people/SnowFightStudios/sounds/643790</w:t>
+        </w:r>
+      </w:hyperlink>
+      <w:r>
+        <w:t xml:space="preserve"> </w:t>
+      </w:r>
+      <w:r>
+        <w:tab/>
+      </w:r>
+      <w:r>
+        <w:t>***</w:t>
       </w:r>
     </w:p>
     <w:p/>
-    <w:p/>
-    <w:p>
-      <w:r>
-        <w:t xml:space="preserve">maybe </w:t>
-      </w:r>
-      <w:r>
-        <w:t xml:space="preserve">1 </w:t>
-      </w:r>
-      <w:hyperlink r:id="rId15" w:history="1">
-        <w:r>
-          <w:rPr>
-            <w:rStyle w:val="Hyperlink"/>
-          </w:rPr>
-          <w:t>https://freesound.org/people/Destructo20/sounds/824702</w:t>
-        </w:r>
-      </w:hyperlink>
-      <w:r>
-        <w:t xml:space="preserve"> </w:t>
-      </w:r>
-    </w:p>
-    <w:p>
-      <w:r>
-        <w:t xml:space="preserve">maybe </w:t>
-      </w:r>
-      <w:r>
-        <w:t>2</w:t>
-      </w:r>
-      <w:r>
-        <w:t xml:space="preserve"> </w:t>
-      </w:r>
-      <w:hyperlink r:id="rId16" w:history="1">
-        <w:r>
-          <w:rPr>
-            <w:rStyle w:val="Hyperlink"/>
-          </w:rPr>
-          <w:t>https://freesound.org/people/SergeQuadrado/sounds/797741</w:t>
-        </w:r>
-      </w:hyperlink>
-      <w:r>
-        <w:t xml:space="preserve"> </w:t>
-      </w:r>
-    </w:p>
-    <w:p>
-      <w:r>
-        <w:t>maybe</w:t>
+    <w:p>
+      <w:r>
+        <w:t>ambience</w:t>
+      </w:r>
+      <w:r>
+        <w:t xml:space="preserve"> 1</w:t>
+      </w:r>
+      <w:r>
+        <w:t xml:space="preserve"> </w:t>
+      </w:r>
+      <w:hyperlink r:id="rId28" w:history="1">
+        <w:r>
+          <w:rPr>
+            <w:rStyle w:val="Hyperlink"/>
+          </w:rPr>
+          <w:t>https://freesound.org/people/klankbeeld/sounds/832662</w:t>
+        </w:r>
+      </w:hyperlink>
+      <w:r>
+        <w:t xml:space="preserve"> </w:t>
+      </w:r>
+    </w:p>
+    <w:p>
+      <w:r>
+        <w:t>ambience</w:t>
       </w:r>
       <w:r>
         <w:t xml:space="preserve"> 3 </w:t>
       </w:r>
-      <w:hyperlink r:id="rId17" w:history="1">
-        <w:r>
-          <w:rPr>
-            <w:rStyle w:val="Hyperlink"/>
-          </w:rPr>
-          <w:t>https://freesound.org/people/ceethewhite/sounds/796080</w:t>
-        </w:r>
-      </w:hyperlink>
-      <w:r>
-        <w:t xml:space="preserve"> </w:t>
-      </w:r>
-    </w:p>
-    <w:p>
-      <w:r>
-        <w:t xml:space="preserve">these were found </w:t>
-      </w:r>
+      <w:hyperlink r:id="rId29" w:history="1">
+        <w:r>
+          <w:rPr>
+            <w:rStyle w:val="Hyperlink"/>
+          </w:rPr>
+          <w:t>https://freesound.org/people/Ultra-Edward/sounds/831431</w:t>
+        </w:r>
+      </w:hyperlink>
+      <w:r>
+        <w:t xml:space="preserve"> </w:t>
+      </w:r>
+    </w:p>
+    <w:p>
       <w:proofErr w:type="spellStart"/>
       <w:r>
-        <w:t>befoe</w:t>
+        <w:t>to</w:t>
       </w:r>
       <w:proofErr w:type="spellEnd"/>
       <w:r>
-        <w:t xml:space="preserve"> Sunday meeting and have narrowed them down</w:t>
-      </w:r>
-    </w:p>
-    <w:p/>
-    <w:p>
-      <w:proofErr w:type="spellStart"/>
-      <w:r>
-        <w:t>playerScream</w:t>
-      </w:r>
-      <w:proofErr w:type="spellEnd"/>
-      <w:r>
-        <w:t xml:space="preserve"> </w:t>
-      </w:r>
-      <w:hyperlink r:id="rId18" w:history="1">
-        <w:r>
-          <w:rPr>
-            <w:rStyle w:val="Hyperlink"/>
-          </w:rPr>
-          <w:t>https://freesound.org/people/vtownpunks/sounds/63639</w:t>
-        </w:r>
-      </w:hyperlink>
-      <w:r>
-        <w:t xml:space="preserve"> </w:t>
-      </w:r>
-    </w:p>
-    <w:p>
-      <w:r>
-        <w:t xml:space="preserve">footsteps 1 </w:t>
-      </w:r>
-      <w:hyperlink r:id="rId19" w:history="1">
-        <w:r>
-          <w:rPr>
-            <w:rStyle w:val="Hyperlink"/>
-          </w:rPr>
-          <w:t>https://freesound.org/people/atleastrelatively/sounds/816413</w:t>
-        </w:r>
-      </w:hyperlink>
-    </w:p>
-    <w:p>
-      <w:r>
-        <w:t xml:space="preserve">footsteps 2 </w:t>
-      </w:r>
-      <w:hyperlink r:id="rId20" w:history="1">
-        <w:r>
-          <w:rPr>
-            <w:rStyle w:val="Hyperlink"/>
-          </w:rPr>
-          <w:t>https://freesound.org/people/qubodup/sounds/816019</w:t>
-        </w:r>
-      </w:hyperlink>
-      <w:r>
-        <w:t xml:space="preserve"> </w:t>
-      </w:r>
-    </w:p>
-    <w:p>
-      <w:r>
-        <w:lastRenderedPageBreak/>
-        <w:t xml:space="preserve">footsteps 3 </w:t>
-      </w:r>
-      <w:hyperlink r:id="rId21" w:history="1">
-        <w:r>
-          <w:rPr>
-            <w:rStyle w:val="Hyperlink"/>
-          </w:rPr>
-          <w:t>https://freesound.org/people/qubodup/sounds/816018</w:t>
-        </w:r>
-      </w:hyperlink>
-      <w:r>
-        <w:t xml:space="preserve"> </w:t>
-      </w:r>
-    </w:p>
-    <w:p>
-      <w:r>
-        <w:t xml:space="preserve">footsteps 4 </w:t>
-      </w:r>
-      <w:hyperlink r:id="rId22" w:history="1">
-        <w:r>
-          <w:rPr>
-            <w:rStyle w:val="Hyperlink"/>
-          </w:rPr>
-          <w:t>https://freesound.org/people/suchiradhar/sounds/790057</w:t>
-        </w:r>
-      </w:hyperlink>
-      <w:r>
-        <w:t xml:space="preserve"> </w:t>
-      </w:r>
-    </w:p>
-    <w:p>
-      <w:r>
-        <w:t xml:space="preserve">footsteps 5 </w:t>
-      </w:r>
-      <w:hyperlink r:id="rId23" w:history="1">
-        <w:r>
-          <w:rPr>
-            <w:rStyle w:val="Hyperlink"/>
-          </w:rPr>
-          <w:t>https://freesound.org/people/Baderomar96/sounds/788512</w:t>
-        </w:r>
-      </w:hyperlink>
-      <w:r>
-        <w:t xml:space="preserve"> </w:t>
-      </w:r>
-    </w:p>
-    <w:p/>
-    <w:p>
-      <w:r>
-        <w:t xml:space="preserve"> </w:t>
-      </w:r>
-      <w:r>
-        <w:t>siren</w:t>
-      </w:r>
-      <w:r>
-        <w:t xml:space="preserve"> </w:t>
-      </w:r>
-      <w:hyperlink r:id="rId24" w:history="1">
-        <w:r>
-          <w:rPr>
-            <w:rStyle w:val="Hyperlink"/>
-          </w:rPr>
-          <w:t>https://freesound.org/people/kevp888/sounds/830006</w:t>
-        </w:r>
-      </w:hyperlink>
-      <w:r>
-        <w:t xml:space="preserve"> </w:t>
-      </w:r>
-    </w:p>
-    <w:p/>
-    <w:p/>
-    <w:p>
-      <w:r>
-        <w:t xml:space="preserve">zombie 1 </w:t>
-      </w:r>
-      <w:hyperlink r:id="rId25" w:history="1">
-        <w:r>
-          <w:rPr>
-            <w:rStyle w:val="Hyperlink"/>
-          </w:rPr>
-          <w:t>https://freesound.org/people/iSaria/sounds/326266</w:t>
-        </w:r>
-      </w:hyperlink>
-    </w:p>
-    <w:p>
-      <w:r>
-        <w:t xml:space="preserve">zombie 2 </w:t>
-      </w:r>
-      <w:hyperlink r:id="rId26" w:history="1">
-        <w:r>
-          <w:rPr>
-            <w:rStyle w:val="Hyperlink"/>
-          </w:rPr>
-          <w:t>https://freesound.org/people/klankbeeld/sounds/126323</w:t>
-        </w:r>
-      </w:hyperlink>
-      <w:r>
-        <w:t xml:space="preserve"> </w:t>
-      </w:r>
-    </w:p>
-    <w:p>
-      <w:r>
-        <w:t xml:space="preserve">zombie 3 </w:t>
-      </w:r>
-      <w:hyperlink r:id="rId27" w:history="1">
-        <w:r>
-          <w:rPr>
-            <w:rStyle w:val="Hyperlink"/>
-          </w:rPr>
-          <w:t>https://freesound.org/people/SnowFightStudios/sounds/643790</w:t>
-        </w:r>
-      </w:hyperlink>
-      <w:r>
-        <w:t xml:space="preserve"> </w:t>
-      </w:r>
-    </w:p>
-    <w:p/>
-    <w:p/>
-    <w:p>
+        <w:t xml:space="preserve"> large for unity</w:t>
+      </w:r>
+      <w:r>
+        <w:br/>
+      </w:r>
       <w:r>
         <w:t>ambience</w:t>
       </w:r>
       <w:r>
-        <w:t xml:space="preserve"> 1</w:t>
-      </w:r>
-      <w:r>
-        <w:t xml:space="preserve"> </w:t>
-      </w:r>
-      <w:hyperlink r:id="rId28" w:history="1">
-        <w:r>
-          <w:rPr>
-            <w:rStyle w:val="Hyperlink"/>
-          </w:rPr>
-          <w:t>https://freesound.org/people/klankbeeld/sounds/832662</w:t>
-        </w:r>
-      </w:hyperlink>
-      <w:r>
-        <w:t xml:space="preserve"> </w:t>
-      </w:r>
+        <w:t xml:space="preserve"> 2 </w:t>
+      </w:r>
+      <w:hyperlink r:id="rId30" w:history="1">
+        <w:r>
+          <w:rPr>
+            <w:rStyle w:val="Hyperlink"/>
+          </w:rPr>
+          <w:t>https://freesound.org/people/Stagno/sounds/832262</w:t>
+        </w:r>
+      </w:hyperlink>
     </w:p>
     <w:p>
       <w:r>
         <w:t>ambience</w:t>
       </w:r>
       <w:r>
-        <w:t xml:space="preserve"> 2 </w:t>
-      </w:r>
-      <w:hyperlink r:id="rId29" w:history="1">
-        <w:r>
-          <w:rPr>
-            <w:rStyle w:val="Hyperlink"/>
-          </w:rPr>
-          <w:t>https://freesound.org/people/Stagno/sounds/832262</w:t>
+        <w:t xml:space="preserve"> 4 </w:t>
+      </w:r>
+      <w:hyperlink r:id="rId31" w:history="1">
+        <w:r>
+          <w:rPr>
+            <w:rStyle w:val="Hyperlink"/>
+          </w:rPr>
+          <w:t>https://freesound.org/people/klankbeeld/sounds/176587</w:t>
         </w:r>
       </w:hyperlink>
       <w:r>
@@ -512,44 +569,6 @@
         <w:t>ambience</w:t>
       </w:r>
       <w:r>
-        <w:t xml:space="preserve"> 3 </w:t>
-      </w:r>
-      <w:hyperlink r:id="rId30" w:history="1">
-        <w:r>
-          <w:rPr>
-            <w:rStyle w:val="Hyperlink"/>
-          </w:rPr>
-          <w:t>https://freesound.org/people/Ultra-Edward/sounds/831431</w:t>
-        </w:r>
-      </w:hyperlink>
-      <w:r>
-        <w:t xml:space="preserve"> </w:t>
-      </w:r>
-    </w:p>
-    <w:p>
-      <w:r>
-        <w:t>ambience</w:t>
-      </w:r>
-      <w:r>
-        <w:t xml:space="preserve"> 4 </w:t>
-      </w:r>
-      <w:hyperlink r:id="rId31" w:history="1">
-        <w:r>
-          <w:rPr>
-            <w:rStyle w:val="Hyperlink"/>
-          </w:rPr>
-          <w:t>https://freesound.org/people/klankbeeld/sounds/176587</w:t>
-        </w:r>
-      </w:hyperlink>
-      <w:r>
-        <w:t xml:space="preserve"> </w:t>
-      </w:r>
-    </w:p>
-    <w:p>
-      <w:r>
-        <w:t>ambience</w:t>
-      </w:r>
-      <w:r>
         <w:t xml:space="preserve"> 5 </w:t>
       </w:r>
       <w:hyperlink r:id="rId32" w:history="1">
@@ -583,8 +602,6 @@
         <w:t xml:space="preserve"> </w:t>
       </w:r>
     </w:p>
-    <w:p/>
-    <w:p/>
     <w:sectPr>
       <w:pgSz w:w="12240" w:h="15840"/>
       <w:pgMar w:top="1440" w:right="1440" w:bottom="1440" w:left="1440" w:header="720" w:footer="720" w:gutter="0"/>
@@ -1198,7 +1215,6 @@
   <w:style w:type="character" w:default="1" w:styleId="DefaultParagraphFont">
     <w:name w:val="Default Paragraph Font"/>
     <w:uiPriority w:val="1"/>
-    <w:semiHidden/>
     <w:unhideWhenUsed/>
   </w:style>
   <w:style w:type="table" w:default="1" w:styleId="TableNormal">

</xml_diff>